<commit_message>
Record production research candidates and fetch arbitrage totals.
Save the JPX arbitrage market total without participant names, and keep AI BRAIN LIVE on a limited precision-watch scope until a real symbol row exists.

Co-authored-by: infoyuusuke-afk <infoyuusuke-afk@users.noreply.github.com>
</commit_message>
<xml_diff>
--- a/docs/100oku/100億PROJECT_MASTER_SPEC.docx
+++ b/docs/100oku/100億PROJECT_MASTER_SPEC.docx
@@ -821,7 +821,7 @@
           </w:tcPr>
           <w:p>
             <w:r>
-              <w:t>FETCHED 2/17。`trading_adoption=false`</w:t>
+              <w:t>FETCHED 3/17。`trading_adoption=false`</w:t>
             </w:r>
           </w:p>
         </w:tc>
@@ -843,7 +843,7 @@
           </w:tcPr>
           <w:p>
             <w:r>
-              <w:t>PARTIAL</w:t>
+              <w:t>PASS</w:t>
             </w:r>
           </w:p>
         </w:tc>
@@ -853,7 +853,7 @@
           </w:tcPr>
           <w:p>
             <w:r>
-              <w:t>二段表示はある。保存中の live ファイルに候補も仮想約定も無い</w:t>
+              <w:t>二段表示の配線。本番候補は 0。選出・Entry・Exit の精度は NOT_RUN</w:t>
             </w:r>
           </w:p>
         </w:tc>
@@ -1080,6 +1080,11 @@
       </w:r>
     </w:p>
     <w:p>
+      <w:r>
+        <w:t>現在の Brain 探索範囲は全市場ではない。Control は `UNIVERSE_SCOPE=LIMITED / PRECISION_WATCH_ONLY` と出す。市場合計の統計から、市場全体で選んだ銘柄とは書かない。</w:t>
+      </w:r>
+    </w:p>
+    <w:p>
       <w:pPr>
         <w:pStyle w:val="Heading2"/>
       </w:pPr>
@@ -1099,17 +1104,17 @@
     </w:p>
     <w:p>
       <w:r>
-        <w:t>2. AI Brain の研究候補。`candidate_id`、銘柄、方向、発見時刻、Entry 候補時刻、trigger、理由、generator、相関、lead-lag、regime を持つ。`execution_authority=true` の行は表示しない。価格は `price_fresh=true` のときだけ現在値にする。</w:t>
+        <w:t>2. AI Brain の研究候補。実データの銘柄行ができたときだけ `candidate_id` を作る。保存する項目は `candidate_id`、銘柄、`LONG` / `SHORT` / `WATCH` / `NO-TRADE`、`candidate_created_at`、`entry_candidate_at`、`source_generator`、`trigger`、`main_reasons`、`market_regime`、`available_at`、`data_quality`、`universe_scope`、`research_status` である。`execution_authority=true` の行は表示しない。価格は `price_fresh=true` のときだけ現在値にする。</w:t>
       </w:r>
     </w:p>
     <w:p>
       <w:r>
-        <w:t>保存中の `brain_shadow_live.json` には研究候補が無い。選出銘柄、方向、時刻、trigger、現在値は `NOT AVAILABLE` である。方向を `NO-TRADE` と補完しない。`NO-TRADE` は、記録された候補がそう言ったときだけ使う。</w:t>
+        <w:t>本番ファイル `data/research_candidates/candidates.jsonl` の候補は 0 件である。理由は `NO_SYMBOL_LEVEL_OBSERVATION`。空売り比率、先物投資部門、裁定残の市場合計は銘柄候補にしない。fixture は本番統計に入れない。選出銘柄、方向、時刻、trigger、現在値は `NOT AVAILABLE` のままである。方向を `NO-TRADE` と補完しない。`NO-TRADE` は、記録された候補がそう言ったときだけ使う。</w:t>
       </w:r>
     </w:p>
     <w:p>
       <w:r>
-        <w:t>`candidate_id` が行に既にあるときだけ、仮想 Entry の記録へ写す。無いときに ID を作らない。</w:t>
+        <w:t>`candidate_id` が行に既にあるときだけ、仮想 Entry の記録へ写す。Shadow の Entry 条件は固定 Strategy のままである。Brain 候補に合わせて緩めない。無いときに ID を作らない。</w:t>
       </w:r>
     </w:p>
     <w:p>
@@ -1122,12 +1127,17 @@
     </w:p>
     <w:p>
       <w:r>
-        <w:t>相関と lead-lag は、Brain 候補の項目である。候補が無いときの Control は `NOT AVAILABLE` である。</w:t>
+        <w:t>相関と lead-lag の設計は `scripts/lead_lag_research.py` にある。状態は `DESIGN_ONLY`。測定ペアは 0。相関係数は保存していない。Control の相関と lead-lag の値は `NOT AVAILABLE`、engine 表示は `DESIGN_ONLY / NOT MEASURED` である。</w:t>
       </w:r>
     </w:p>
     <w:p>
       <w:r>
-        <w:t>Research Data Lane の 17 系列は、相関エンジンの出力ではない。取得済みの 2 系列も `trading_adoption=false` であり、先導銘柄の判定には使っていない。</w:t>
+        <w:t>測定できるのは、両方の系列が同じ `session_date` を持ち、各点に `available_at` があり、きれいな観測が 30 以上重なるときだけである。その条件が揃っても、この版は係数を計算しない。市場合計は銘柄の先導にしない。fixture は入れない。</w:t>
+      </w:r>
+    </w:p>
+    <w:p>
+      <w:r>
+        <w:t>Research Data Lane の 17 系列は、相関エンジンの出力ではない。取得済みの 3 系列も `trading_adoption=false` であり、先導銘柄の判定には使っていない。</w:t>
       </w:r>
     </w:p>
     <w:p>
@@ -1190,12 +1200,28 @@
         <w:pStyle w:val="ListBullet"/>
       </w:pPr>
       <w:r>
-        <w:t>Research status: `FETCHED 2/17 / trading_adoption=false`</w:t>
+        <w:t>Research status: `FETCHED 3/17 / trading_adoption=false`</w:t>
+      </w:r>
+    </w:p>
+    <w:p>
+      <w:pPr>
+        <w:pStyle w:val="ListBullet"/>
+      </w:pPr>
+      <w:r>
+        <w:t>Universe scope: `LIMITED / PRECISION_WATCH_ONLY`</w:t>
+      </w:r>
+    </w:p>
+    <w:p>
+      <w:pPr>
+        <w:pStyle w:val="ListBullet"/>
+      </w:pPr>
+      <w:r>
+        <w:t>本番候補 0、linked 0、Shadow Entry 0</w:t>
       </w:r>
     </w:p>
     <w:p>
       <w:r>
-        <w:t>ピックの本数、推奨銘柄、確信度は、候補ファイルが無いので出さない。N=0 のとき、確率、EV、確信度を生成しない。</w:t>
+        <w:t>ピックの本数、推奨銘柄、確信度は、本番候補が 0 なので出さない。N=0 のとき、確率、EV、確信度を生成しない。</w:t>
       </w:r>
     </w:p>
     <w:p>
@@ -1241,7 +1267,7 @@
     </w:p>
     <w:p>
       <w:r>
-        <w:t>Registry は 17 件である。FETCHED は 2 件。残り 15 件は NOT_FETCHED。取得済みでも売買条件には入れない。</w:t>
+        <w:t>Registry は 17 件である。FETCHED は 3 件。残り 14 件は NOT_FETCHED。取得済みでも売買条件には入れない。</w:t>
       </w:r>
     </w:p>
     <w:tbl>
@@ -1482,7 +1508,7 @@
           </w:tcPr>
           <w:p>
             <w:r>
-              <w:t>NOT_FETCHED</w:t>
+              <w:t>FETCHED</w:t>
             </w:r>
           </w:p>
         </w:tc>
@@ -1492,7 +1518,7 @@
           </w:tcPr>
           <w:p>
             <w:r>
-              <w:t>未切り出し</w:t>
+              <w:t>日次。セッション後</w:t>
             </w:r>
           </w:p>
         </w:tc>
@@ -1502,7 +1528,7 @@
           </w:tcPr>
           <w:p>
             <w:r>
-              <w:t>参加者別 PDF は保存しない</w:t>
+              <w:t>JPX 裁定取引の市場合計。参加者名と原票は保存しない</w:t>
             </w:r>
           </w:p>
         </w:tc>
@@ -2181,6 +2207,102 @@
       </w:r>
     </w:p>
     <w:p>
+      <w:pPr>
+        <w:pStyle w:val="Heading3"/>
+      </w:pPr>
+      <w:r>
+        <w:t>arbitrage_balance</w:t>
+      </w:r>
+    </w:p>
+    <w:p>
+      <w:pPr>
+        <w:pStyle w:val="ListBullet"/>
+      </w:pPr>
+      <w:r>
+        <w:t>3本目の FETCHED。JPX の日次 xls から市場合計だけを保存した。履歴は 10 セッション。最新は `session_date=2026-10-01`</w:t>
+      </w:r>
+    </w:p>
+    <w:p>
+      <w:pPr>
+        <w:pStyle w:val="ListBullet"/>
+      </w:pPr>
+      <w:r>
+        <w:t>売買は売り 64,563 千株、買い 8,980 千株。売りポジション合計 7,985 千株。買いポジション合計 849,191 千株。単位は千株</w:t>
+      </w:r>
+    </w:p>
+    <w:p>
+      <w:pPr>
+        <w:pStyle w:val="ListBullet"/>
+      </w:pPr>
+      <w:r>
+        <w:t>全社合計は売買の合計と一致した。参加者名の行は保存していない</w:t>
+      </w:r>
+    </w:p>
+    <w:p>
+      <w:pPr>
+        <w:pStyle w:val="ListBullet"/>
+      </w:pPr>
+      <w:r>
+        <w:t>sha256: `004234bbfe70c28477815aece51a98db0e74923f84c2855a7aa27a5846d0c519`</w:t>
+      </w:r>
+    </w:p>
+    <w:p>
+      <w:pPr>
+        <w:pStyle w:val="ListBullet"/>
+      </w:pPr>
+      <w:r>
+        <w:t>取得元: https://www.jpx.co.jp/markets/statistics-equities/program/ の `261001.xls`。原票は repo に置かない。`raw_retained=false`</w:t>
+      </w:r>
+    </w:p>
+    <w:p>
+      <w:pPr>
+        <w:pStyle w:val="ListBullet"/>
+      </w:pPr>
+      <w:r>
+        <w:t>`first_seen_at=2026-10-06T02:01:58.033482+09:00`。`available_at` と `fetched_at` は同じ</w:t>
+      </w:r>
+    </w:p>
+    <w:p>
+      <w:pPr>
+        <w:pStyle w:val="ListBullet"/>
+      </w:pPr>
+      <w:r>
+        <w:t>`published_at=2026-10-05T16:00:31+09:00`。根拠は HTTP Last-Modified</w:t>
+      </w:r>
+    </w:p>
+    <w:p>
+      <w:pPr>
+        <w:pStyle w:val="ListBullet"/>
+      </w:pPr>
+      <w:r>
+        <w:t>シートの `2026年10月5日` は日付であり、`published_at` ではない。`sheet_label_date=2026-10-05`</w:t>
+      </w:r>
+    </w:p>
+    <w:p>
+      <w:pPr>
+        <w:pStyle w:val="ListBullet"/>
+      </w:pPr>
+      <w:r>
+        <w:t>当限の注記は 2026-12 限まで。これは限月のラベルであり、時刻ではない</w:t>
+      </w:r>
+    </w:p>
+    <w:p>
+      <w:pPr>
+        <w:pStyle w:val="ListBullet"/>
+      </w:pPr>
+      <w:r>
+        <w:t>観測日 2026-10-06 の営業日差は 3。freshness は `STALE`。研究用の買い残は null</w:t>
+      </w:r>
+    </w:p>
+    <w:p>
+      <w:pPr>
+        <w:pStyle w:val="ListBullet"/>
+      </w:pPr>
+      <w:r>
+        <w:t>`trading_adoption=false`。銘柄候補にはしない</w:t>
+      </w:r>
+    </w:p>
+    <w:p>
       <w:r>
         <w:t>`scripts/investor_regime.py` の既存アーカイブは、この lane の保存先ではない。`build_output` は呼ばない。</w:t>
       </w:r>
@@ -2444,7 +2566,7 @@
           </w:tcPr>
           <w:p>
             <w:r>
-              <w:t>2/17 だけ FETCHED。売買には未接続</w:t>
+              <w:t>3/17 だけ FETCHED。売買には未接続</w:t>
             </w:r>
           </w:p>
         </w:tc>
@@ -2627,7 +2749,7 @@
     </w:p>
     <w:p>
       <w:r>
-        <w:t>FETCHED は 2/17 である。残り 15 件は停滞として残っている。次の系列を、ライセンスと取得可能性の確認より前に保存しない。空売り比率と投資部門先物の次点として調べた裁定残高は、参加者別 PDF を保存しない。NT、IV/PCR、日経の共有ブランド、DEX、TradingView の非公式 API は、確認が終わるまで NOT_FETCHED のままである。</w:t>
+        <w:t>FETCHED は 3/17 である。残り 14 件は停滞として残っている。次の系列を、ライセンスと取得可能性の確認より前に保存しない。裁定残高は市場合計だけを保存し、参加者別の原票は保存しない。NT、IV/PCR、日経の共有ブランド、DEX、TradingView の非公式 API は、確認が終わるまで NOT_FETCHED のままである。</w:t>
       </w:r>
     </w:p>
     <w:p>

</xml_diff>

<commit_message>
Label the 2026-10-03 G0 table apart from the historical baseline.
The G0 through G5 rows stay the current acceptance matrix. The 2026-09-22 cockpit spec is the only historical baseline, and later collector and supervisor passes stay on their own rows.

Co-authored-by: infoyuusuke-afk <infoyuusuke-afk@users.noreply.github.com>
</commit_message>
<xml_diff>
--- a/docs/100oku/100億PROJECT_MASTER_SPEC.docx
+++ b/docs/100oku/100億PROJECT_MASTER_SPEC.docx
@@ -290,7 +290,7 @@
           </w:tcPr>
           <w:p>
             <w:r>
-              <w:t>2026-09-22 の Cockpit Baseline</w:t>
+              <w:t>HISTORICAL BASELINE。2026-09-22 の Cockpit Baseline。G0 から G5 の表はここに無い</w:t>
             </w:r>
           </w:p>
         </w:tc>
@@ -432,6 +432,21 @@
         <w:t>ライブの PASS は Owner PC の観測だけが満たす。合成 fixture は照合器のテストであり、G0 から G5 の PASS ではない。</w:t>
       </w:r>
     </w:p>
+    <w:p>
+      <w:r>
+        <w:t>G0 から G5 の行は、2026-10-03 に観測した Current Acceptance である。出典は `docs/P0_ACCEPTANCE_MATRIX.md`。これは HISTORICAL BASELINE ではない。G1 から G5 を一括の NOT_RUN とは書かない。G3 は PARTIAL である。</w:t>
+      </w:r>
+    </w:p>
+    <w:p>
+      <w:r>
+        <w:t>HISTORICAL BASELINE は `docs/AI_COCKPIT_MASTER_SPEC.md`（2026-09-22、checkpoint `1e856eeacdf71006fa095da27e1aa6e46862fb7b`）だけを指す。その文書は、この G0 から G5 の表を持たない。</w:t>
+      </w:r>
+    </w:p>
+    <w:p>
+      <w:r>
+        <w:t>その後に Owner PC で確認した Collector の銘柄対応 PASS と、Supervisor の台帳再読込 PASS は、下の別行である。G0 から G5 の状態を置き換えない。MS2、RSS、Collector、Gateway、Strategy、AI SHADOW の経路確認を、この G0 の FAIL と同じ項目として読まない。</w:t>
+      </w:r>
+    </w:p>
     <w:tbl>
       <w:tblPr>
         <w:tblW w:type="auto" w:w="0"/>
@@ -501,7 +516,7 @@
           </w:tcPr>
           <w:p>
             <w:r>
-              <w:t>2026-10-03 の起動は確認画面で停止。`docs/P0_ACCEPTANCE_MATRIX.md`。OWNER ACTION PENDING</w:t>
+              <w:t>Current Acceptance（2026-10-03）。HISTORICAL BASELINE ではない。起動は確認画面で停止。`docs/P0_ACCEPTANCE_MATRIX.md`。OWNER ACTION PENDING</w:t>
             </w:r>
           </w:p>
         </w:tc>
@@ -533,7 +548,7 @@
           </w:tcPr>
           <w:p>
             <w:r>
-              <w:t>同じ表。OWNER ACTION PENDING</w:t>
+              <w:t>Current Acceptance（2026-10-03）。HISTORICAL BASELINE ではない。OWNER ACTION PENDING</w:t>
             </w:r>
           </w:p>
         </w:tc>
@@ -565,7 +580,7 @@
           </w:tcPr>
           <w:p>
             <w:r>
-              <w:t>器は KEEP。ライブ系列は未実施</w:t>
+              <w:t>Current Acceptance（2026-10-03）。HISTORICAL BASELINE ではない。器は KEEP。ライブ系列は未実施</w:t>
             </w:r>
           </w:p>
         </w:tc>
@@ -597,7 +612,7 @@
           </w:tcPr>
           <w:p>
             <w:r>
-              <w:t>拒否契約は KEEP。ライブの正例は NOT_RUN</w:t>
+              <w:t>Current Acceptance（2026-10-03）。HISTORICAL BASELINE ではない。拒否契約は KEEP。ライブの正例は NOT_RUN</w:t>
             </w:r>
           </w:p>
         </w:tc>
@@ -629,7 +644,7 @@
           </w:tcPr>
           <w:p>
             <w:r>
-              <w:t>MS2 表示の取り込みは MISSING</w:t>
+              <w:t>Current Acceptance（2026-10-03）。HISTORICAL BASELINE ではない。MS2 表示の取り込みは MISSING</w:t>
             </w:r>
           </w:p>
         </w:tc>
@@ -661,7 +676,7 @@
           </w:tcPr>
           <w:p>
             <w:r>
-              <w:t>コード準備済み。ライブは未実施</w:t>
+              <w:t>Current Acceptance（2026-10-03）。HISTORICAL BASELINE ではない。コード準備済み。ライブは未実施</w:t>
             </w:r>
           </w:p>
         </w:tc>
@@ -2470,7 +2485,7 @@
           </w:tcPr>
           <w:p>
             <w:r>
-              <w:t>専用ブック経由。G0 は FAIL、G1 は NOT_RUN</w:t>
+              <w:t>専用ブック経由。Current Acceptance（2026-10-03）では G0 は FAIL、G1 は NOT_RUN。HISTORICAL BASELINE（2026-09-22）の状態ではない</w:t>
             </w:r>
           </w:p>
         </w:tc>

</xml_diff>

<commit_message>
Fetch the master branch before the daily D: copy.
The 16:45 task now runs a wrapper that fast-forwards a clean worktree to cursor/master-spec-fetch-sync-d483 and copies only after that update. Fetch failures, a dirty tree, local-only commits, diverged history, missing files, and hash mismatches leave D: unchanged.

Co-authored-by: infoyuusuke-afk <infoyuusuke-afk@users.noreply.github.com>
</commit_message>
<xml_diff>
--- a/docs/100oku/100億PROJECT_MASTER_SPEC.docx
+++ b/docs/100oku/100億PROJECT_MASTER_SPEC.docx
@@ -22,7 +22,12 @@
     </w:p>
     <w:p>
       <w:r>
-        <w:t>Owner PC の初回同期は PASS した。確認行は `MASTER_SPEC_SYNC=PASS`、`DESTINATION_WRITTEN=1`、`CLOUD_AGENT_WROTE_D_DRIVE=0`、`ARCHIVE=NONE_FIRST_SYNC`、`REPO_COMMIT=116ed28014af7b627b69882b2920ca09aa34924a`。そのとき同期された `100億PROJECT_MASTER_SPEC.md` は 4,644 bytes で、Research Data Lane の短い台帳だった。Word 版はその同期に含まれていない。この版はそれより後の作業コピーであり、この記録を書いた Cloud Agent は D: へ書いていない。毎日 16:45 JST のタスクは未登録である。</w:t>
+        <w:t>Owner PC の初回同期は PASS した。確認行は `MASTER_SPEC_SYNC=PASS`、`DESTINATION_WRITTEN=1`、`CLOUD_AGENT_WROTE_D_DRIVE=0`、`ARCHIVE=NONE_FIRST_SYNC`、`REPO_COMMIT=116ed28014af7b627b69882b2920ca09aa34924a`。そのとき同期された `100億PROJECT_MASTER_SPEC.md` は 4,644 bytes で、Research Data Lane の短い台帳だった。Word 版はその同期に含まれていない。</w:t>
+      </w:r>
+    </w:p>
+    <w:p>
+      <w:r>
+        <w:t>Owner PC はその後、commit `768d1f47553b70e85c0d04f6e4962820a2aef1ab` を `D:\100億PROJECT\MASTER_SPEC` へコピーした。`MASTER_SPEC_SYNC=PASS`、`DESTINATION_WRITTEN=1`、`CLOUD_AGENT_WROTE_D_DRIVE=0`、`ARCHIVE=2026-10-06_0227`。その時点の Markdown は 32,123 bytes、sha256 `b0d21ae173611a9a792335bca2ba5f1e3673dc97f52d78f5517c5393ebc551da`。Word は 51,104 bytes、sha256 `72e9ba6fbb9278ab30d6b2f0f797a529a6fca5ef0b38074bc1ab5ac6adcc6d29`。いま D: にある正式原本はその commit である。この段落を含む後続の repo 差分は、次に wrapper が成功するまで D: へは入らない。毎日 16:45 JST のタスクは未登録である。</w:t>
       </w:r>
     </w:p>
     <w:p>
@@ -816,6 +821,38 @@
           </w:tcPr>
           <w:p>
             <w:r>
+              <w:t>MASTER 本文の同期</w:t>
+            </w:r>
+          </w:p>
+        </w:tc>
+        <w:tc>
+          <w:tcPr>
+            <w:tcW w:type="dxa" w:w="2880"/>
+          </w:tcPr>
+          <w:p>
+            <w:r>
+              <w:t>PASS</w:t>
+            </w:r>
+          </w:p>
+        </w:tc>
+        <w:tc>
+          <w:tcPr>
+            <w:tcW w:type="dxa" w:w="2880"/>
+          </w:tcPr>
+          <w:p>
+            <w:r>
+              <w:t>commit `768d1f47553b70e85c0d04f6e4962820a2aef1ab`。`ARCHIVE=2026-10-06_0227`。この表を含む後続差分は未同期</w:t>
+            </w:r>
+          </w:p>
+        </w:tc>
+      </w:tr>
+      <w:tr>
+        <w:tc>
+          <w:tcPr>
+            <w:tcW w:type="dxa" w:w="2880"/>
+          </w:tcPr>
+          <w:p>
+            <w:r>
               <w:t>Research Data Lane</w:t>
             </w:r>
           </w:p>
@@ -1028,7 +1065,7 @@
           </w:tcPr>
           <w:p>
             <w:r>
-              <w:t>登録スクリプトはある。`-Register` は実行していない</w:t>
+              <w:t>wrapper はある。`-Register` は実行していない。fetch なしの固定 worktree コピーは登録しない</w:t>
             </w:r>
           </w:p>
         </w:tc>
@@ -2979,7 +3016,7 @@
     </w:p>
     <w:p>
       <w:r>
-        <w:t>棚卸しの 15 分後、16:45 JST に Owner PC が作業コピーを `D:\100億PROJECT\MASTER_SPEC` へ同期する、が目標のループである。登録スクリプトは `downloads/REGISTER_100OKU_MASTER_SPEC_TASK.ps1`、タスク名 `TradeCockpit-100oku-MasterSpec-Sync`、時刻 16:45、前提はローカル時計が JST であることである。`-Register` を付けるまで登録しない。この版の完成時点では未登録である。</w:t>
+        <w:t>棚卸しの 15 分後、16:45 JST に Owner PC が作業コピーを `D:\100億PROJECT\MASTER_SPEC` へ同期する、が目標のループである。実行ファイルは `downloads/UPDATE_AND_SYNC_100OKU_MASTER_SPEC.ps1` である。順序は、`git fetch origin`、remote branch `cursor/master-spec-fetch-sync-d483` の最新 commit の確認、専用 worktree が dirty でないことの確認、HEAD がその commit と同じかその祖先であるときだけの fast-forward、対象ファイルの存在確認、`downloads/SYNC_100OKU_MASTER_SPEC.ps1`、sha256 の一致、`LAST_SYNC.json` への source commit と destination hash と result の保存である。remote に新しい commit が無い日は同じ commit を同期してよい。fetch 失敗、dirty、ローカルだけの commit、履歴の分岐、欠落、空、sha256 不一致では D: を更新しない。後続の MASTER 更新は、この remote branch を fast-forward する。登録スクリプトは `downloads/REGISTER_100OKU_MASTER_SPEC_TASK.ps1`、タスク名 `TradeCockpit-100oku-MasterSpec-Sync`、時刻 16:45、前提はローカル時計が JST であることである。`-Register` を付けるまで登録しない。この版では未登録である。固定 worktree を fetch なしで毎日コピーするタスクは登録しない。</w:t>
       </w:r>
     </w:p>
     <w:p>
@@ -3017,7 +3054,7 @@
     </w:p>
     <w:p>
       <w:r>
-        <w:t>4. Owner PC が同期スクリプトを実行する</w:t>
+        <w:t>4. Owner PC の wrapper が remote branch を fetch し、clean な専用 worktree をその commit へ進めてから同期スクリプトを実行する</w:t>
       </w:r>
     </w:p>
     <w:p>
@@ -3042,7 +3079,7 @@
     </w:p>
     <w:p>
       <w:r>
-        <w:t>9. 16:45 の登録は、MASTER と Word が揃った後の別作業である。この版では登録しない</w:t>
+        <w:t>9. 16:45 の登録は、fetch してから同期する wrapper が揃った後の別作業である。この版では登録しない</w:t>
       </w:r>
     </w:p>
     <w:p>

</xml_diff>